<commit_message>
version final de los archivos
se corrige el entregable y se agrega el .bat para que las pruebas corran con un solo comando
</commit_message>
<xml_diff>
--- a/Trabajo Práctico 1_ BDD.docx
+++ b/Trabajo Práctico 1_ BDD.docx
@@ -303,9 +303,14 @@
         <w:spacing w:after="200" w:line="360" w:lineRule="auto"/>
       </w:pPr>
       <w:r>
-        <w:t>Se debe entregar link al repositorio público de GitHub con el código del proyecto pasando todas las pruebas (./</w:t>
-      </w:r>
-      <w:proofErr w:type="spellStart"/>
+        <w:t xml:space="preserve">Se debe entregar link al repositorio público de GitHub con el código del proyecto pasando todas las pruebas </w:t>
+      </w:r>
+      <w:proofErr w:type="gramStart"/>
+      <w:r>
+        <w:t>(./</w:t>
+      </w:r>
+      <w:proofErr w:type="spellStart"/>
+      <w:proofErr w:type="gramEnd"/>
       <w:r>
         <w:t>gradlew</w:t>
       </w:r>
@@ -334,43 +339,24 @@
       <w:r>
         <w:br w:type="page"/>
       </w:r>
+    </w:p>
+    <w:p>
+      <w:pPr>
+        <w:pStyle w:val="Ttulo1"/>
+      </w:pPr>
       <w:r>
         <w:lastRenderedPageBreak/>
-        <w:t xml:space="preserve">Para solucionar el </w:t>
-      </w:r>
-      <w:proofErr w:type="spellStart"/>
-      <w:r>
-        <w:t>tp</w:t>
-      </w:r>
-      <w:proofErr w:type="spellEnd"/>
-      <w:r>
-        <w:t xml:space="preserve">, se </w:t>
-      </w:r>
-      <w:proofErr w:type="spellStart"/>
-      <w:r>
-        <w:t>implemento</w:t>
-      </w:r>
-      <w:proofErr w:type="spellEnd"/>
-      <w:r>
-        <w:t xml:space="preserve"> de la siguiente manera</w:t>
+        <w:t>1-Definicion de la regla a implementar</w:t>
+      </w:r>
+    </w:p>
+    <w:p>
+      <w:r>
+        <w:t xml:space="preserve"> “El total de un grupo no debe ser negativo”.</w:t>
       </w:r>
     </w:p>
     <w:p>
       <w:pPr>
         <w:pStyle w:val="Ttulo1"/>
-      </w:pPr>
-      <w:r>
-        <w:t>1-Definicion de la regla a implementar</w:t>
-      </w:r>
-    </w:p>
-    <w:p>
-      <w:r>
-        <w:t xml:space="preserve"> “El total de un grupo no debe ser negativo”.</w:t>
-      </w:r>
-    </w:p>
-    <w:p>
-      <w:pPr>
-        <w:pStyle w:val="Ttulo1"/>
         <w:rPr>
           <w:lang w:val="es-AR"/>
         </w:rPr>
@@ -436,137 +422,53 @@
     <w:p>
       <w:pPr>
         <w:rPr>
-          <w:b/>
-          <w:bCs/>
-          <w:lang w:val="es-AR"/>
-        </w:rPr>
-      </w:pPr>
-      <w:r>
-        <w:rPr>
-          <w:b/>
-          <w:bCs/>
-          <w:lang w:val="es-AR"/>
-        </w:rPr>
-        <w:t>Se agrego en esta ruta</w:t>
-      </w:r>
-      <w:r>
-        <w:rPr>
-          <w:b/>
-          <w:bCs/>
-          <w:lang w:val="es-AR"/>
-        </w:rPr>
-        <w:t xml:space="preserve">: </w:t>
-      </w:r>
-      <w:proofErr w:type="spellStart"/>
-      <w:r>
-        <w:rPr>
-          <w:b/>
-          <w:bCs/>
-          <w:lang w:val="es-AR"/>
-        </w:rPr>
-        <w:t>src</w:t>
-      </w:r>
-      <w:proofErr w:type="spellEnd"/>
-      <w:r>
-        <w:rPr>
-          <w:b/>
-          <w:bCs/>
-          <w:lang w:val="es-AR"/>
-        </w:rPr>
-        <w:t>/test/</w:t>
-      </w:r>
-      <w:proofErr w:type="spellStart"/>
-      <w:r>
-        <w:rPr>
-          <w:b/>
-          <w:bCs/>
-          <w:lang w:val="es-AR"/>
-        </w:rPr>
-        <w:t>resources</w:t>
-      </w:r>
-      <w:proofErr w:type="spellEnd"/>
-      <w:r>
-        <w:rPr>
-          <w:b/>
-          <w:bCs/>
-          <w:lang w:val="es-AR"/>
-        </w:rPr>
-        <w:t>/</w:t>
-      </w:r>
-      <w:proofErr w:type="spellStart"/>
-      <w:r>
-        <w:rPr>
-          <w:b/>
-          <w:bCs/>
-          <w:lang w:val="es-AR"/>
-        </w:rPr>
-        <w:t>features</w:t>
-      </w:r>
-      <w:proofErr w:type="spellEnd"/>
-      <w:r>
-        <w:rPr>
-          <w:b/>
-          <w:bCs/>
-          <w:lang w:val="es-AR"/>
-        </w:rPr>
-        <w:t>/</w:t>
-      </w:r>
-      <w:proofErr w:type="spellStart"/>
-      <w:r>
-        <w:rPr>
-          <w:b/>
-          <w:bCs/>
-          <w:lang w:val="es-AR"/>
-        </w:rPr>
-        <w:t>total_grupo_no_negativo.feature</w:t>
-      </w:r>
-      <w:proofErr w:type="spellEnd"/>
-    </w:p>
-    <w:p>
-      <w:pPr>
-        <w:rPr>
-          <w:lang w:val="es-AR"/>
-        </w:rPr>
-      </w:pPr>
-      <w:r>
-        <w:rPr>
-          <w:lang w:val="es-AR"/>
-        </w:rPr>
-        <w:t>El archivo</w:t>
-      </w:r>
-      <w:r>
-        <w:rPr>
-          <w:lang w:val="es-AR"/>
-        </w:rPr>
-        <w:t xml:space="preserve"> </w:t>
-      </w:r>
-      <w:proofErr w:type="spellStart"/>
-      <w:r>
-        <w:rPr>
-          <w:lang w:val="es-AR"/>
-        </w:rPr>
-        <w:t>total_grupo_no_negativo.feature</w:t>
-      </w:r>
-      <w:proofErr w:type="spellEnd"/>
-      <w:r>
-        <w:rPr>
-          <w:lang w:val="es-AR"/>
-        </w:rPr>
-        <w:t xml:space="preserve"> en</w:t>
-      </w:r>
-      <w:r>
-        <w:rPr>
-          <w:lang w:val="es-AR"/>
-        </w:rPr>
-        <w:t xml:space="preserve"> que consta del siguiente texto</w:t>
-      </w:r>
-    </w:p>
-    <w:p>
-      <w:pPr>
-        <w:rPr>
-          <w:lang w:val="es-AR"/>
-        </w:rPr>
-      </w:pPr>
+          <w:lang w:val="es-AR"/>
+        </w:rPr>
+      </w:pPr>
+      <w:r>
+        <w:rPr>
+          <w:lang w:val="es-AR"/>
+        </w:rPr>
+        <w:t>en el archivo src/fastAcceptanceTest/resource/features/grupos/</w:t>
+      </w:r>
+      <w:r>
+        <w:rPr>
+          <w:lang w:val="es-AR"/>
+        </w:rPr>
+        <w:t>c</w:t>
+      </w:r>
+      <w:r>
+        <w:rPr>
+          <w:lang w:val="es-AR"/>
+        </w:rPr>
+        <w:t>rear</w:t>
+      </w:r>
+      <w:r>
+        <w:rPr>
+          <w:lang w:val="es-AR"/>
+        </w:rPr>
+        <w:t>_g</w:t>
+      </w:r>
+      <w:r>
+        <w:rPr>
+          <w:lang w:val="es-AR"/>
+        </w:rPr>
+        <w:t xml:space="preserve">rupos.feature se </w:t>
+      </w:r>
+      <w:proofErr w:type="spellStart"/>
+      <w:r>
+        <w:rPr>
+          <w:lang w:val="es-AR"/>
+        </w:rPr>
+        <w:t>agrego</w:t>
+      </w:r>
+      <w:proofErr w:type="spellEnd"/>
+      <w:r>
+        <w:rPr>
+          <w:lang w:val="es-AR"/>
+        </w:rPr>
+        <w:t xml:space="preserve"> el siguiente escenario</w:t>
+      </w:r>
     </w:p>
     <w:p>
       <w:pPr>
@@ -601,168 +503,99 @@
           <w:lang w:val="es-AR"/>
         </w:rPr>
       </w:pPr>
-      <w:r>
-        <w:rPr>
-          <w:lang w:val="es-AR"/>
-        </w:rPr>
-        <w:t>Característica: Validación del total del grupo</w:t>
-      </w:r>
-    </w:p>
-    <w:p>
-      <w:pPr>
-        <w:rPr>
-          <w:lang w:val="es-AR"/>
-        </w:rPr>
-      </w:pPr>
-      <w:r>
-        <w:rPr>
-          <w:lang w:val="es-AR"/>
-        </w:rPr>
-        <w:t xml:space="preserve">  Como administrador de un grupo de gastos</w:t>
-      </w:r>
-    </w:p>
-    <w:p>
-      <w:pPr>
-        <w:rPr>
-          <w:lang w:val="es-AR"/>
-        </w:rPr>
-      </w:pPr>
-      <w:r>
-        <w:rPr>
-          <w:lang w:val="es-AR"/>
-        </w:rPr>
-        <w:t xml:space="preserve">  Quiero asegurar que el saldo total no sea negativo</w:t>
-      </w:r>
-    </w:p>
-    <w:p>
-      <w:pPr>
-        <w:rPr>
-          <w:lang w:val="es-AR"/>
-        </w:rPr>
-      </w:pPr>
-      <w:r>
-        <w:rPr>
-          <w:lang w:val="es-AR"/>
-        </w:rPr>
-        <w:t xml:space="preserve">  Para mantener la integridad contable del grupo</w:t>
-      </w:r>
-    </w:p>
-    <w:p>
-      <w:pPr>
-        <w:rPr>
-          <w:lang w:val="es-AR"/>
-        </w:rPr>
-      </w:pPr>
-    </w:p>
-    <w:p>
-      <w:pPr>
-        <w:rPr>
-          <w:lang w:val="es-AR"/>
-        </w:rPr>
-      </w:pPr>
-      <w:r>
-        <w:rPr>
-          <w:lang w:val="es-AR"/>
-        </w:rPr>
-        <w:t xml:space="preserve">  Escenario: Un grupo nuevo comienza con total en cero</w:t>
-      </w:r>
-    </w:p>
-    <w:p>
-      <w:pPr>
-        <w:rPr>
-          <w:lang w:val="es-AR"/>
-        </w:rPr>
-      </w:pPr>
-      <w:r>
-        <w:rPr>
-          <w:lang w:val="es-AR"/>
-        </w:rPr>
-        <w:t xml:space="preserve">    Dado que creo un grupo llamado "Viaje a Bariloche"</w:t>
-      </w:r>
-    </w:p>
-    <w:p>
-      <w:pPr>
-        <w:rPr>
-          <w:lang w:val="es-AR"/>
-        </w:rPr>
-      </w:pPr>
-      <w:r>
-        <w:rPr>
-          <w:lang w:val="es-AR"/>
-        </w:rPr>
-        <w:t xml:space="preserve">    Entonces el total del grupo debe ser 0 pesos</w:t>
-      </w:r>
-    </w:p>
-    <w:p>
-      <w:pPr>
-        <w:rPr>
-          <w:lang w:val="es-AR"/>
-        </w:rPr>
-      </w:pPr>
-    </w:p>
-    <w:p>
-      <w:pPr>
-        <w:rPr>
-          <w:lang w:val="es-AR"/>
-        </w:rPr>
-      </w:pPr>
-      <w:r>
-        <w:rPr>
-          <w:lang w:val="es-AR"/>
-        </w:rPr>
-        <w:t xml:space="preserve">  Escenario: No se puede registrar un gasto que resulte en un total negativo</w:t>
-      </w:r>
-    </w:p>
-    <w:p>
-      <w:pPr>
-        <w:rPr>
-          <w:lang w:val="es-AR"/>
-        </w:rPr>
-      </w:pPr>
-      <w:r>
-        <w:rPr>
-          <w:lang w:val="es-AR"/>
-        </w:rPr>
-        <w:t xml:space="preserve">    Dado que el grupo "Asado" tiene un total de 1000 pesos</w:t>
-      </w:r>
-    </w:p>
-    <w:p>
-      <w:pPr>
-        <w:rPr>
-          <w:lang w:val="es-AR"/>
-        </w:rPr>
-      </w:pPr>
-      <w:r>
-        <w:rPr>
-          <w:lang w:val="es-AR"/>
-        </w:rPr>
-        <w:t xml:space="preserve">    Cuando intento registrar un gasto de -1500 pesos por "Devolución"</w:t>
-      </w:r>
-    </w:p>
-    <w:p>
-      <w:pPr>
-        <w:rPr>
-          <w:lang w:val="es-AR"/>
-        </w:rPr>
-      </w:pPr>
-      <w:r>
-        <w:rPr>
-          <w:lang w:val="es-AR"/>
-        </w:rPr>
-        <w:t xml:space="preserve">    Entonces se debe rechazar la operación por "Saldo negativo no permitido"</w:t>
-      </w:r>
-    </w:p>
-    <w:p>
-      <w:pPr>
-        <w:rPr>
-          <w:lang w:val="es-AR"/>
-        </w:rPr>
-      </w:pPr>
-      <w:r>
-        <w:rPr>
-          <w:lang w:val="es-AR"/>
-        </w:rPr>
-        <w:t xml:space="preserve">    Y el total del grupo "Asado" debe permanecer en 1000 pesos</w:t>
+    </w:p>
+    <w:p>
+      <w:pPr>
+        <w:rPr>
+          <w:lang w:val="es-AR"/>
+        </w:rPr>
+      </w:pPr>
+    </w:p>
+    <w:p>
+      <w:pPr>
+        <w:rPr>
+          <w:lang w:val="es-AR"/>
+        </w:rPr>
+      </w:pPr>
+      <w:r>
+        <w:rPr>
+          <w:lang w:val="es-AR"/>
+        </w:rPr>
+        <w:t>Característica: Crear Grupo para repartir gastos</w:t>
+      </w:r>
+    </w:p>
+    <w:p>
+      <w:pPr>
+        <w:rPr>
+          <w:lang w:val="es-AR"/>
+        </w:rPr>
+      </w:pPr>
+    </w:p>
+    <w:p>
+      <w:pPr>
+        <w:rPr>
+          <w:lang w:val="es-AR"/>
+        </w:rPr>
+      </w:pPr>
+      <w:r>
+        <w:rPr>
+          <w:lang w:val="es-AR"/>
+        </w:rPr>
+        <w:t xml:space="preserve">  Regla: El total del gasto no debe ser cero ni negativo</w:t>
+      </w:r>
+    </w:p>
+    <w:p>
+      <w:pPr>
+        <w:rPr>
+          <w:lang w:val="es-AR"/>
+        </w:rPr>
+      </w:pPr>
+    </w:p>
+    <w:p>
+      <w:pPr>
+        <w:rPr>
+          <w:lang w:val="es-AR"/>
+        </w:rPr>
+      </w:pPr>
+      <w:r>
+        <w:rPr>
+          <w:lang w:val="es-AR"/>
+        </w:rPr>
+        <w:t xml:space="preserve">    Escenario: No puedo crear un grupo con precio negativo de </w:t>
+      </w:r>
+      <w:proofErr w:type="spellStart"/>
+      <w:r>
+        <w:rPr>
+          <w:lang w:val="es-AR"/>
+        </w:rPr>
+        <w:t>comsimision</w:t>
+      </w:r>
+      <w:proofErr w:type="spellEnd"/>
+    </w:p>
+    <w:p>
+      <w:pPr>
+        <w:rPr>
+          <w:lang w:val="es-AR"/>
+        </w:rPr>
+      </w:pPr>
+      <w:r>
+        <w:rPr>
+          <w:lang w:val="es-AR"/>
+        </w:rPr>
+        <w:t xml:space="preserve">      Cuando el usuario intenta crear un grupo indicando que alguno pone importe cero o negativo</w:t>
+      </w:r>
+    </w:p>
+    <w:p>
+      <w:pPr>
+        <w:rPr>
+          <w:lang w:val="es-AR"/>
+        </w:rPr>
+      </w:pPr>
+      <w:r>
+        <w:rPr>
+          <w:lang w:val="es-AR"/>
+        </w:rPr>
+        <w:t xml:space="preserve">      Entonces no debería crear el grupo</w:t>
       </w:r>
     </w:p>
     <w:p>
@@ -787,36 +620,26 @@
       <w:r>
         <w:t xml:space="preserve">3-implementacion de las pruebas </w:t>
       </w:r>
-      <w:r>
-        <w:t>rápidas</w:t>
-      </w:r>
+      <w:proofErr w:type="spellStart"/>
+      <w:r>
+        <w:t>rapidas</w:t>
+      </w:r>
+      <w:proofErr w:type="spellEnd"/>
       <w:r>
         <w:t xml:space="preserve"> de </w:t>
       </w:r>
-      <w:r>
-        <w:t>aceptación</w:t>
-      </w:r>
+      <w:proofErr w:type="spellStart"/>
+      <w:r>
+        <w:t>aceptacion</w:t>
+      </w:r>
+      <w:proofErr w:type="spellEnd"/>
       <w:r>
         <w:t xml:space="preserve"> (sin modificar los originales)</w:t>
       </w:r>
     </w:p>
     <w:p>
       <w:r>
-        <w:t xml:space="preserve">En la ruta </w:t>
-      </w:r>
-      <w:r>
-        <w:t>main\src\fastAcceptanceTest\java\ar\com\grupoesfera\repartir\steps</w:t>
-      </w:r>
-    </w:p>
-    <w:p>
-      <w:r>
-        <w:t xml:space="preserve">Se agrego el archivo </w:t>
-      </w:r>
-      <w:r>
-        <w:t>GrupoStepDefinitions</w:t>
-      </w:r>
-      <w:r>
-        <w:t>.java</w:t>
+        <w:t>Se crea un archivo “TotalDelGastoNoDebeSerCeroNiNegativoSteps.java” con el fin de implementar los test del escenario planteado</w:t>
       </w:r>
     </w:p>
     <w:p>
@@ -838,6 +661,93 @@
         <w:t>Se implemento en la carpeta principal la clase grupo.java</w:t>
       </w:r>
     </w:p>
+    <w:p/>
+    <w:p>
+      <w:pPr>
+        <w:pStyle w:val="Ttulo1"/>
+      </w:pPr>
+      <w:r>
+        <w:t>5-nota adicional:</w:t>
+      </w:r>
+    </w:p>
+    <w:p>
+      <w:r>
+        <w:t xml:space="preserve">Se creo un archivo .bat para correr con una sola instrucción los test </w:t>
+      </w:r>
+      <w:proofErr w:type="spellStart"/>
+      <w:r>
+        <w:t>rapidos</w:t>
+      </w:r>
+      <w:proofErr w:type="spellEnd"/>
+      <w:r>
+        <w:t xml:space="preserve"> de </w:t>
+      </w:r>
+      <w:proofErr w:type="spellStart"/>
+      <w:r>
+        <w:t>aceptacion</w:t>
+      </w:r>
+      <w:proofErr w:type="spellEnd"/>
+      <w:r>
+        <w:t xml:space="preserve"> en los que consta las siguientes líneas</w:t>
+      </w:r>
+    </w:p>
+    <w:p>
+      <w:pPr>
+        <w:rPr>
+          <w:lang w:val="es-AR"/>
+        </w:rPr>
+      </w:pPr>
+      <w:r>
+        <w:rPr>
+          <w:lang w:val="es-AR"/>
+        </w:rPr>
+        <w:t>@echo off</w:t>
+      </w:r>
+    </w:p>
+    <w:p>
+      <w:pPr>
+        <w:rPr>
+          <w:lang w:val="es-AR"/>
+        </w:rPr>
+      </w:pPr>
+      <w:proofErr w:type="spellStart"/>
+      <w:r>
+        <w:rPr>
+          <w:lang w:val="es-AR"/>
+        </w:rPr>
+        <w:t>call</w:t>
+      </w:r>
+      <w:proofErr w:type="spellEnd"/>
+      <w:r>
+        <w:rPr>
+          <w:lang w:val="es-AR"/>
+        </w:rPr>
+        <w:t xml:space="preserve"> </w:t>
+      </w:r>
+      <w:proofErr w:type="spellStart"/>
+      <w:r>
+        <w:rPr>
+          <w:lang w:val="es-AR"/>
+        </w:rPr>
+        <w:t>gradlew</w:t>
+      </w:r>
+      <w:proofErr w:type="spellEnd"/>
+      <w:r>
+        <w:rPr>
+          <w:lang w:val="es-AR"/>
+        </w:rPr>
+        <w:t xml:space="preserve"> </w:t>
+      </w:r>
+      <w:proofErr w:type="spellStart"/>
+      <w:r>
+        <w:rPr>
+          <w:lang w:val="es-AR"/>
+        </w:rPr>
+        <w:t>fastAcceptanceTest</w:t>
+      </w:r>
+      <w:proofErr w:type="spellEnd"/>
+    </w:p>
+    <w:p/>
     <w:sectPr>
       <w:pgSz w:w="11909" w:h="16834"/>
       <w:pgMar w:top="1440" w:right="1440" w:bottom="1440" w:left="1440" w:header="720" w:footer="720" w:gutter="0"/>
@@ -1658,7 +1568,6 @@
     <w:basedOn w:val="Normal"/>
     <w:next w:val="Normal"/>
     <w:uiPriority w:val="9"/>
-    <w:semiHidden/>
     <w:unhideWhenUsed/>
     <w:qFormat/>
     <w:pPr>
@@ -1752,7 +1661,6 @@
   <w:style w:type="character" w:default="1" w:styleId="Fuentedeprrafopredeter">
     <w:name w:val="Default Paragraph Font"/>
     <w:uiPriority w:val="1"/>
-    <w:semiHidden/>
     <w:unhideWhenUsed/>
   </w:style>
   <w:style w:type="table" w:default="1" w:styleId="Tablanormal">

</xml_diff>